<commit_message>
docs: add project stack
</commit_message>
<xml_diff>
--- a/docs/02-tz.docx
+++ b/docs/02-tz.docx
@@ -1,6 +1,6 @@
 
 <file path=word/document.xml><?xml version="1.0" encoding="utf-8"?>
-<w:document xmlns:wpc="http://schemas.microsoft.com/office/word/2010/wordprocessingCanvas" xmlns:cx="http://schemas.microsoft.com/office/drawing/2014/chartex" xmlns:cx1="http://schemas.microsoft.com/office/drawing/2015/9/8/chartex" xmlns:cx2="http://schemas.microsoft.com/office/drawing/2015/10/21/chartex" xmlns:cx3="http://schemas.microsoft.com/office/drawing/2016/5/9/chartex" xmlns:cx4="http://schemas.microsoft.com/office/drawing/2016/5/10/chartex" xmlns:cx5="http://schemas.microsoft.com/office/drawing/2016/5/11/chartex" xmlns:cx6="http://schemas.microsoft.com/office/drawing/2016/5/12/chartex" xmlns:cx7="http://schemas.microsoft.com/office/drawing/2016/5/13/chartex" xmlns:cx8="http://schemas.microsoft.com/office/drawing/2016/5/14/chartex" xmlns:mc="http://schemas.openxmlformats.org/markup-compatibility/2006" xmlns:aink="http://schemas.microsoft.com/office/drawing/2016/ink" xmlns:am3d="http://schemas.microsoft.com/office/drawing/2017/model3d" xmlns:o="urn:schemas-microsoft-com:office:office" xmlns:oel="http://schemas.microsoft.com/office/2019/extlst" xmlns:r="http://schemas.openxmlformats.org/officeDocument/2006/relationships" xmlns:m="http://schemas.openxmlformats.org/officeDocument/2006/math" xmlns:v="urn:schemas-microsoft-com:vml" xmlns:wp14="http://schemas.microsoft.com/office/word/2010/wordprocessingDrawing" xmlns:wp="http://schemas.openxmlformats.org/drawingml/2006/wordprocessingDrawing" xmlns:w10="urn:schemas-microsoft-com:office:word" xmlns:w="http://schemas.openxmlformats.org/wordprocessingml/2006/main" xmlns:w14="http://schemas.microsoft.com/office/word/2010/wordml" xmlns:w15="http://schemas.microsoft.com/office/word/2012/wordml" xmlns:w16cex="http://schemas.microsoft.com/office/word/2018/wordml/cex" xmlns:w16cid="http://schemas.microsoft.com/office/word/2016/wordml/cid" xmlns:w16="http://schemas.microsoft.com/office/word/2018/wordml" xmlns:w16sdtdh="http://schemas.microsoft.com/office/word/2020/wordml/sdtdatahash" xmlns:w16se="http://schemas.microsoft.com/office/word/2015/wordml/symex" xmlns:wpg="http://schemas.microsoft.com/office/word/2010/wordprocessingGroup" xmlns:wpi="http://schemas.microsoft.com/office/word/2010/wordprocessingInk" xmlns:wne="http://schemas.microsoft.com/office/word/2006/wordml" xmlns:wps="http://schemas.microsoft.com/office/word/2010/wordprocessingShape" mc:Ignorable="w14 w15 w16se w16cid w16 w16cex w16sdtdh wp14">
+<w:document xmlns:wpc="http://schemas.microsoft.com/office/word/2010/wordprocessingCanvas" xmlns:cx="http://schemas.microsoft.com/office/drawing/2014/chartex" xmlns:cx1="http://schemas.microsoft.com/office/drawing/2015/9/8/chartex" xmlns:cx2="http://schemas.microsoft.com/office/drawing/2015/10/21/chartex" xmlns:cx3="http://schemas.microsoft.com/office/drawing/2016/5/9/chartex" xmlns:cx4="http://schemas.microsoft.com/office/drawing/2016/5/10/chartex" xmlns:cx5="http://schemas.microsoft.com/office/drawing/2016/5/11/chartex" xmlns:cx6="http://schemas.microsoft.com/office/drawing/2016/5/12/chartex" xmlns:cx7="http://schemas.microsoft.com/office/drawing/2016/5/13/chartex" xmlns:cx8="http://schemas.microsoft.com/office/drawing/2016/5/14/chartex" xmlns:mc="http://schemas.openxmlformats.org/markup-compatibility/2006" xmlns:aink="http://schemas.microsoft.com/office/drawing/2016/ink" xmlns:am3d="http://schemas.microsoft.com/office/drawing/2017/model3d" xmlns:o="urn:schemas-microsoft-com:office:office" xmlns:r="http://schemas.openxmlformats.org/officeDocument/2006/relationships" xmlns:m="http://schemas.openxmlformats.org/officeDocument/2006/math" xmlns:v="urn:schemas-microsoft-com:vml" xmlns:wp14="http://schemas.microsoft.com/office/word/2010/wordprocessingDrawing" xmlns:wp="http://schemas.openxmlformats.org/drawingml/2006/wordprocessingDrawing" xmlns:w10="urn:schemas-microsoft-com:office:word" xmlns:w="http://schemas.openxmlformats.org/wordprocessingml/2006/main" xmlns:w14="http://schemas.microsoft.com/office/word/2010/wordml" xmlns:w15="http://schemas.microsoft.com/office/word/2012/wordml" xmlns:w16cex="http://schemas.microsoft.com/office/word/2018/wordml/cex" xmlns:w16cid="http://schemas.microsoft.com/office/word/2016/wordml/cid" xmlns:w16="http://schemas.microsoft.com/office/word/2018/wordml" xmlns:w16sdtdh="http://schemas.microsoft.com/office/word/2020/wordml/sdtdatahash" xmlns:w16se="http://schemas.microsoft.com/office/word/2015/wordml/symex" xmlns:wpg="http://schemas.microsoft.com/office/word/2010/wordprocessingGroup" xmlns:wpi="http://schemas.microsoft.com/office/word/2010/wordprocessingInk" xmlns:wne="http://schemas.microsoft.com/office/word/2006/wordml" xmlns:wps="http://schemas.microsoft.com/office/word/2010/wordprocessingShape" mc:Ignorable="w14 w15 w16se w16cid w16 w16cex w16sdtdh wp14">
   <w:body>
     <w:p>
       <w:pPr>
@@ -17,7 +17,6 @@
         </w:rPr>
         <w:t>Техническое задание для проекта «</w:t>
       </w:r>
-      <w:proofErr w:type="spellStart"/>
       <w:r>
         <w:rPr>
           <w:sz w:val="28"/>
@@ -26,7 +25,6 @@
         </w:rPr>
         <w:t>GetTaskTakePic</w:t>
       </w:r>
-      <w:proofErr w:type="spellEnd"/>
       <w:r>
         <w:rPr>
           <w:sz w:val="28"/>
@@ -203,42 +201,323 @@
       </w:pPr>
       <w:r>
         <w:rPr>
-          <w:sz w:val="28"/>
-          <w:szCs w:val="32"/>
-        </w:rPr>
-        <w:t>Выбор темы задания</w:t>
-      </w:r>
-    </w:p>
-    <w:p>
-      <w:pPr>
-        <w:jc w:val="both"/>
-        <w:rPr>
-          <w:sz w:val="28"/>
-          <w:szCs w:val="32"/>
-        </w:rPr>
-      </w:pPr>
-      <w:r>
-        <w:rPr>
-          <w:sz w:val="28"/>
-          <w:szCs w:val="32"/>
-        </w:rPr>
-        <w:t>Выбор сложности задания</w:t>
-      </w:r>
-    </w:p>
-    <w:p>
-      <w:pPr>
-        <w:jc w:val="both"/>
-        <w:rPr>
-          <w:sz w:val="28"/>
-          <w:szCs w:val="32"/>
-        </w:rPr>
-      </w:pPr>
-      <w:r>
-        <w:rPr>
-          <w:sz w:val="28"/>
-          <w:szCs w:val="32"/>
-        </w:rPr>
-        <w:t>Запрос на задание</w:t>
+          <w:b/>
+          <w:bCs/>
+          <w:sz w:val="28"/>
+          <w:szCs w:val="32"/>
+        </w:rPr>
+        <w:t>FR-01</w:t>
+      </w:r>
+      <w:r>
+        <w:rPr>
+          <w:sz w:val="28"/>
+          <w:szCs w:val="32"/>
+        </w:rPr>
+        <w:t>: Пользователь может выбрать тему задания</w:t>
+      </w:r>
+      <w:r>
+        <w:rPr>
+          <w:sz w:val="28"/>
+          <w:szCs w:val="32"/>
+        </w:rPr>
+        <w:t>.</w:t>
+      </w:r>
+    </w:p>
+    <w:p>
+      <w:pPr>
+        <w:jc w:val="both"/>
+        <w:rPr>
+          <w:sz w:val="28"/>
+          <w:szCs w:val="32"/>
+        </w:rPr>
+      </w:pPr>
+      <w:r>
+        <w:rPr>
+          <w:b/>
+          <w:bCs/>
+          <w:sz w:val="28"/>
+          <w:szCs w:val="32"/>
+        </w:rPr>
+        <w:t>FR-02</w:t>
+      </w:r>
+      <w:r>
+        <w:rPr>
+          <w:sz w:val="28"/>
+          <w:szCs w:val="32"/>
+        </w:rPr>
+        <w:t>: Пользователь может выбрать уровень сложности</w:t>
+      </w:r>
+      <w:r>
+        <w:rPr>
+          <w:sz w:val="28"/>
+          <w:szCs w:val="32"/>
+        </w:rPr>
+        <w:t>.</w:t>
+      </w:r>
+    </w:p>
+    <w:p>
+      <w:pPr>
+        <w:jc w:val="both"/>
+        <w:rPr>
+          <w:sz w:val="28"/>
+          <w:szCs w:val="32"/>
+        </w:rPr>
+      </w:pPr>
+      <w:r>
+        <w:rPr>
+          <w:b/>
+          <w:bCs/>
+          <w:sz w:val="28"/>
+          <w:szCs w:val="32"/>
+        </w:rPr>
+        <w:t>FR-03</w:t>
+      </w:r>
+      <w:r>
+        <w:rPr>
+          <w:sz w:val="28"/>
+          <w:szCs w:val="32"/>
+        </w:rPr>
+        <w:t>: Приложение запрашивает у Gemini задание на поиск объекта в реальном мире на основе выбранной темы/сложности.</w:t>
+      </w:r>
+    </w:p>
+    <w:p>
+      <w:pPr>
+        <w:jc w:val="both"/>
+        <w:rPr>
+          <w:sz w:val="28"/>
+          <w:szCs w:val="32"/>
+        </w:rPr>
+      </w:pPr>
+      <w:r>
+        <w:rPr>
+          <w:b/>
+          <w:bCs/>
+          <w:sz w:val="28"/>
+          <w:szCs w:val="32"/>
+        </w:rPr>
+        <w:t>FR-04</w:t>
+      </w:r>
+      <w:r>
+        <w:rPr>
+          <w:sz w:val="28"/>
+          <w:szCs w:val="32"/>
+        </w:rPr>
+        <w:t>: Пользователь может сделать фото через камеру устройства или выбрать изображение из галереи.</w:t>
+      </w:r>
+    </w:p>
+    <w:p>
+      <w:pPr>
+        <w:jc w:val="both"/>
+        <w:rPr>
+          <w:sz w:val="28"/>
+          <w:szCs w:val="32"/>
+        </w:rPr>
+      </w:pPr>
+      <w:r>
+        <w:rPr>
+          <w:b/>
+          <w:bCs/>
+          <w:sz w:val="28"/>
+          <w:szCs w:val="32"/>
+        </w:rPr>
+        <w:t>FR-05</w:t>
+      </w:r>
+      <w:r>
+        <w:rPr>
+          <w:sz w:val="28"/>
+          <w:szCs w:val="32"/>
+        </w:rPr>
+        <w:t>: Приложение отправляет фото и текст задания в Gemini для проверки соответствия.</w:t>
+      </w:r>
+    </w:p>
+    <w:p>
+      <w:pPr>
+        <w:jc w:val="both"/>
+        <w:rPr>
+          <w:sz w:val="28"/>
+          <w:szCs w:val="32"/>
+        </w:rPr>
+      </w:pPr>
+      <w:r>
+        <w:rPr>
+          <w:b/>
+          <w:bCs/>
+          <w:sz w:val="28"/>
+          <w:szCs w:val="32"/>
+        </w:rPr>
+        <w:t>FR-06</w:t>
+      </w:r>
+      <w:r>
+        <w:rPr>
+          <w:sz w:val="28"/>
+          <w:szCs w:val="32"/>
+        </w:rPr>
+        <w:t>: Приложение отображает результат проверки: «подходит» / «не подходит» с кратким пояснением от ИИ</w:t>
+      </w:r>
+      <w:r>
+        <w:rPr>
+          <w:sz w:val="28"/>
+          <w:szCs w:val="32"/>
+        </w:rPr>
+        <w:t>.</w:t>
+      </w:r>
+    </w:p>
+    <w:p>
+      <w:pPr>
+        <w:jc w:val="both"/>
+        <w:rPr>
+          <w:sz w:val="28"/>
+          <w:szCs w:val="32"/>
+        </w:rPr>
+      </w:pPr>
+      <w:r>
+        <w:rPr>
+          <w:b/>
+          <w:bCs/>
+          <w:sz w:val="28"/>
+          <w:szCs w:val="32"/>
+        </w:rPr>
+        <w:t>FR-07</w:t>
+      </w:r>
+      <w:r>
+        <w:rPr>
+          <w:sz w:val="28"/>
+          <w:szCs w:val="32"/>
+        </w:rPr>
+        <w:t>: При положительном результате приложение воспроизводит короткую вибрацию; при отрицательном — две «гудящие» вибрации</w:t>
+      </w:r>
+      <w:r>
+        <w:rPr>
+          <w:sz w:val="28"/>
+          <w:szCs w:val="32"/>
+        </w:rPr>
+        <w:t>.</w:t>
+      </w:r>
+    </w:p>
+    <w:p>
+      <w:pPr>
+        <w:jc w:val="both"/>
+        <w:rPr>
+          <w:sz w:val="28"/>
+          <w:szCs w:val="32"/>
+        </w:rPr>
+      </w:pPr>
+      <w:r>
+        <w:rPr>
+          <w:b/>
+          <w:bCs/>
+          <w:sz w:val="28"/>
+          <w:szCs w:val="32"/>
+        </w:rPr>
+        <w:t>FR-08</w:t>
+      </w:r>
+      <w:r>
+        <w:rPr>
+          <w:sz w:val="28"/>
+          <w:szCs w:val="32"/>
+        </w:rPr>
+        <w:t>: Пользователь может сохранить проверенное фото в галерею устройства (опционально — с геометкой)</w:t>
+      </w:r>
+    </w:p>
+    <w:p>
+      <w:pPr>
+        <w:jc w:val="both"/>
+        <w:rPr>
+          <w:sz w:val="28"/>
+          <w:szCs w:val="32"/>
+        </w:rPr>
+      </w:pPr>
+      <w:r>
+        <w:rPr>
+          <w:b/>
+          <w:bCs/>
+          <w:sz w:val="28"/>
+          <w:szCs w:val="32"/>
+        </w:rPr>
+        <w:t>FR-09</w:t>
+      </w:r>
+      <w:r>
+        <w:rPr>
+          <w:sz w:val="28"/>
+          <w:szCs w:val="32"/>
+        </w:rPr>
+        <w:t>: Приложение ведёт статистику выполненных заданий по темам и сложностям</w:t>
+      </w:r>
+    </w:p>
+    <w:p>
+      <w:pPr>
+        <w:jc w:val="both"/>
+        <w:rPr>
+          <w:sz w:val="28"/>
+          <w:szCs w:val="32"/>
+        </w:rPr>
+      </w:pPr>
+      <w:r>
+        <w:rPr>
+          <w:b/>
+          <w:bCs/>
+          <w:sz w:val="28"/>
+          <w:szCs w:val="32"/>
+        </w:rPr>
+        <w:t>FR-</w:t>
+      </w:r>
+      <w:r>
+        <w:rPr>
+          <w:b/>
+          <w:bCs/>
+          <w:sz w:val="28"/>
+          <w:szCs w:val="32"/>
+        </w:rPr>
+        <w:t>10</w:t>
+      </w:r>
+      <w:r>
+        <w:rPr>
+          <w:sz w:val="28"/>
+          <w:szCs w:val="32"/>
+        </w:rPr>
+        <w:t xml:space="preserve">: </w:t>
+      </w:r>
+      <w:r>
+        <w:rPr>
+          <w:sz w:val="28"/>
+          <w:szCs w:val="32"/>
+        </w:rPr>
+        <w:t>Стрик (анимация, поделиться)</w:t>
+      </w:r>
+      <w:r>
+        <w:rPr>
+          <w:sz w:val="28"/>
+          <w:szCs w:val="32"/>
+        </w:rPr>
+        <w:t>. Д</w:t>
+      </w:r>
+      <w:r>
+        <w:rPr>
+          <w:sz w:val="28"/>
+          <w:szCs w:val="32"/>
+        </w:rPr>
+        <w:t>обавляется если</w:t>
+      </w:r>
+      <w:r>
+        <w:rPr>
+          <w:sz w:val="28"/>
+          <w:szCs w:val="32"/>
+        </w:rPr>
+        <w:t xml:space="preserve"> задание выполнено</w:t>
+      </w:r>
+      <w:r>
+        <w:rPr>
+          <w:sz w:val="28"/>
+          <w:szCs w:val="32"/>
+        </w:rPr>
+        <w:t xml:space="preserve"> удачно за </w:t>
+      </w:r>
+      <w:r>
+        <w:rPr>
+          <w:sz w:val="28"/>
+          <w:szCs w:val="32"/>
+        </w:rPr>
+        <w:t>меньше, чем</w:t>
       </w:r>
       <w:r>
         <w:rPr>
@@ -252,53 +531,544 @@
           <w:sz w:val="28"/>
           <w:szCs w:val="32"/>
         </w:rPr>
-        <w:t>по заданной теме, определенной сложности</w:t>
-      </w:r>
-    </w:p>
-    <w:p>
-      <w:pPr>
-        <w:jc w:val="both"/>
-        <w:rPr>
-          <w:sz w:val="28"/>
-          <w:szCs w:val="32"/>
-        </w:rPr>
-      </w:pPr>
-      <w:r>
-        <w:rPr>
-          <w:sz w:val="28"/>
-          <w:szCs w:val="32"/>
-        </w:rPr>
-        <w:t>Добавление ф</w:t>
-      </w:r>
-      <w:r>
-        <w:rPr>
-          <w:sz w:val="28"/>
-          <w:szCs w:val="32"/>
-        </w:rPr>
-        <w:t>ото (камера / галерея)</w:t>
-      </w:r>
-      <w:r>
-        <w:rPr>
-          <w:sz w:val="28"/>
-          <w:szCs w:val="32"/>
-        </w:rPr>
-        <w:t xml:space="preserve"> для решения задания</w:t>
-      </w:r>
-    </w:p>
-    <w:p>
-      <w:pPr>
-        <w:jc w:val="both"/>
-        <w:rPr>
-          <w:sz w:val="28"/>
-          <w:szCs w:val="32"/>
-        </w:rPr>
-      </w:pPr>
-      <w:r>
-        <w:rPr>
-          <w:sz w:val="28"/>
-          <w:szCs w:val="32"/>
-        </w:rPr>
-        <w:t>Проверка</w:t>
+        <w:t xml:space="preserve">3 </w:t>
+      </w:r>
+      <w:r>
+        <w:rPr>
+          <w:sz w:val="28"/>
+          <w:szCs w:val="32"/>
+        </w:rPr>
+        <w:t>попытки</w:t>
+      </w:r>
+    </w:p>
+    <w:p>
+      <w:pPr>
+        <w:jc w:val="both"/>
+        <w:rPr>
+          <w:sz w:val="28"/>
+          <w:szCs w:val="32"/>
+        </w:rPr>
+      </w:pPr>
+      <w:r>
+        <w:rPr>
+          <w:b/>
+          <w:bCs/>
+          <w:sz w:val="28"/>
+          <w:szCs w:val="32"/>
+        </w:rPr>
+        <w:lastRenderedPageBreak/>
+        <w:t>FR-</w:t>
+      </w:r>
+      <w:r>
+        <w:rPr>
+          <w:b/>
+          <w:bCs/>
+          <w:sz w:val="28"/>
+          <w:szCs w:val="32"/>
+        </w:rPr>
+        <w:t>11</w:t>
+      </w:r>
+      <w:r>
+        <w:rPr>
+          <w:sz w:val="28"/>
+          <w:szCs w:val="32"/>
+        </w:rPr>
+        <w:t xml:space="preserve">: </w:t>
+      </w:r>
+      <w:r>
+        <w:rPr>
+          <w:sz w:val="28"/>
+          <w:szCs w:val="32"/>
+        </w:rPr>
+        <w:t>Сохранение</w:t>
+      </w:r>
+      <w:r>
+        <w:rPr>
+          <w:sz w:val="28"/>
+          <w:szCs w:val="32"/>
+        </w:rPr>
+        <w:t xml:space="preserve"> текущего</w:t>
+      </w:r>
+      <w:r>
+        <w:rPr>
+          <w:sz w:val="28"/>
+          <w:szCs w:val="32"/>
+        </w:rPr>
+        <w:t xml:space="preserve"> задания и фото в оффлайн</w:t>
+      </w:r>
+      <w:r>
+        <w:rPr>
+          <w:sz w:val="28"/>
+          <w:szCs w:val="32"/>
+        </w:rPr>
+        <w:t xml:space="preserve"> (по возможности)</w:t>
+      </w:r>
+    </w:p>
+    <w:p>
+      <w:pPr>
+        <w:jc w:val="both"/>
+        <w:rPr>
+          <w:sz w:val="28"/>
+          <w:szCs w:val="32"/>
+        </w:rPr>
+      </w:pPr>
+      <w:r>
+        <w:rPr>
+          <w:b/>
+          <w:bCs/>
+          <w:sz w:val="28"/>
+          <w:szCs w:val="32"/>
+        </w:rPr>
+        <w:t>FR-</w:t>
+      </w:r>
+      <w:r>
+        <w:rPr>
+          <w:b/>
+          <w:bCs/>
+          <w:sz w:val="28"/>
+          <w:szCs w:val="32"/>
+        </w:rPr>
+        <w:t>12</w:t>
+      </w:r>
+      <w:r>
+        <w:rPr>
+          <w:sz w:val="28"/>
+          <w:szCs w:val="32"/>
+        </w:rPr>
+        <w:t xml:space="preserve">: </w:t>
+      </w:r>
+      <w:r>
+        <w:rPr>
+          <w:sz w:val="28"/>
+          <w:szCs w:val="32"/>
+        </w:rPr>
+        <w:t>Повтор или отмена при ошибке нейросети (без сброса прогресса)</w:t>
+      </w:r>
+    </w:p>
+    <w:p>
+      <w:pPr>
+        <w:jc w:val="both"/>
+        <w:rPr>
+          <w:sz w:val="28"/>
+          <w:szCs w:val="32"/>
+        </w:rPr>
+      </w:pPr>
+      <w:r>
+        <w:rPr>
+          <w:b/>
+          <w:bCs/>
+          <w:sz w:val="28"/>
+          <w:szCs w:val="32"/>
+        </w:rPr>
+        <w:t>FR-</w:t>
+      </w:r>
+      <w:r>
+        <w:rPr>
+          <w:b/>
+          <w:bCs/>
+          <w:sz w:val="28"/>
+          <w:szCs w:val="32"/>
+        </w:rPr>
+        <w:t>13</w:t>
+      </w:r>
+      <w:r>
+        <w:rPr>
+          <w:sz w:val="28"/>
+          <w:szCs w:val="32"/>
+        </w:rPr>
+        <w:t xml:space="preserve">: </w:t>
+      </w:r>
+      <w:r>
+        <w:rPr>
+          <w:sz w:val="28"/>
+          <w:szCs w:val="32"/>
+        </w:rPr>
+        <w:t>Предупреждение при неадекватном фото</w:t>
+      </w:r>
+    </w:p>
+    <w:p>
+      <w:pPr>
+        <w:jc w:val="both"/>
+        <w:rPr>
+          <w:sz w:val="28"/>
+          <w:szCs w:val="32"/>
+        </w:rPr>
+      </w:pPr>
+    </w:p>
+    <w:p>
+      <w:pPr>
+        <w:jc w:val="both"/>
+        <w:rPr>
+          <w:sz w:val="28"/>
+          <w:szCs w:val="32"/>
+        </w:rPr>
+      </w:pPr>
+      <w:r>
+        <w:rPr>
+          <w:sz w:val="28"/>
+          <w:szCs w:val="32"/>
+        </w:rPr>
+        <w:t>Нефункциональные:</w:t>
+      </w:r>
+    </w:p>
+    <w:p>
+      <w:pPr>
+        <w:jc w:val="both"/>
+        <w:rPr>
+          <w:sz w:val="28"/>
+          <w:szCs w:val="32"/>
+        </w:rPr>
+      </w:pPr>
+      <w:r>
+        <w:rPr>
+          <w:b/>
+          <w:bCs/>
+          <w:kern w:val="0"/>
+          <w:sz w:val="28"/>
+          <w:szCs w:val="32"/>
+          <w:lang w:val="en-US"/>
+          <w14:ligatures w14:val="none"/>
+        </w:rPr>
+        <w:t>N</w:t>
+      </w:r>
+      <w:r>
+        <w:rPr>
+          <w:b/>
+          <w:bCs/>
+          <w:kern w:val="0"/>
+          <w:sz w:val="28"/>
+          <w:szCs w:val="32"/>
+          <w14:ligatures w14:val="none"/>
+        </w:rPr>
+        <w:t>FR-0</w:t>
+      </w:r>
+      <w:r>
+        <w:rPr>
+          <w:b/>
+          <w:bCs/>
+          <w:kern w:val="0"/>
+          <w:sz w:val="28"/>
+          <w:szCs w:val="32"/>
+          <w14:ligatures w14:val="none"/>
+        </w:rPr>
+        <w:t>1</w:t>
+      </w:r>
+      <w:r>
+        <w:rPr>
+          <w:kern w:val="0"/>
+          <w:sz w:val="28"/>
+          <w:szCs w:val="32"/>
+          <w14:ligatures w14:val="none"/>
+        </w:rPr>
+        <w:t xml:space="preserve">: </w:t>
+      </w:r>
+      <w:r>
+        <w:rPr>
+          <w:sz w:val="28"/>
+          <w:szCs w:val="32"/>
+        </w:rPr>
+        <w:t>Максимально снизить задержку между пользователем и нейросетью. Максимум 5-10 секунд. Не учитывать скорость соединения пользователя.</w:t>
+      </w:r>
+    </w:p>
+    <w:p>
+      <w:pPr>
+        <w:jc w:val="both"/>
+        <w:rPr>
+          <w:sz w:val="28"/>
+          <w:szCs w:val="32"/>
+        </w:rPr>
+      </w:pPr>
+      <w:r>
+        <w:rPr>
+          <w:b/>
+          <w:bCs/>
+          <w:kern w:val="0"/>
+          <w:sz w:val="28"/>
+          <w:szCs w:val="32"/>
+          <w:lang w:val="en-US"/>
+          <w14:ligatures w14:val="none"/>
+        </w:rPr>
+        <w:t>N</w:t>
+      </w:r>
+      <w:r>
+        <w:rPr>
+          <w:b/>
+          <w:bCs/>
+          <w:kern w:val="0"/>
+          <w:sz w:val="28"/>
+          <w:szCs w:val="32"/>
+          <w14:ligatures w14:val="none"/>
+        </w:rPr>
+        <w:t>FR-0</w:t>
+      </w:r>
+      <w:r>
+        <w:rPr>
+          <w:b/>
+          <w:bCs/>
+          <w:kern w:val="0"/>
+          <w:sz w:val="28"/>
+          <w:szCs w:val="32"/>
+          <w14:ligatures w14:val="none"/>
+        </w:rPr>
+        <w:t>2</w:t>
+      </w:r>
+      <w:r>
+        <w:rPr>
+          <w:kern w:val="0"/>
+          <w:sz w:val="28"/>
+          <w:szCs w:val="32"/>
+          <w14:ligatures w14:val="none"/>
+        </w:rPr>
+        <w:t xml:space="preserve">: </w:t>
+      </w:r>
+      <w:r>
+        <w:rPr>
+          <w:sz w:val="28"/>
+          <w:szCs w:val="32"/>
+        </w:rPr>
+        <w:t>Добавить элементы загрузки для наглядности. (Нет ощущения остановки приложения).</w:t>
+      </w:r>
+    </w:p>
+    <w:p>
+      <w:pPr>
+        <w:jc w:val="both"/>
+        <w:rPr>
+          <w:sz w:val="28"/>
+          <w:szCs w:val="32"/>
+        </w:rPr>
+      </w:pPr>
+      <w:r>
+        <w:rPr>
+          <w:b/>
+          <w:bCs/>
+          <w:kern w:val="0"/>
+          <w:sz w:val="28"/>
+          <w:szCs w:val="32"/>
+          <w:lang w:val="en-US"/>
+          <w14:ligatures w14:val="none"/>
+        </w:rPr>
+        <w:t>N</w:t>
+      </w:r>
+      <w:r>
+        <w:rPr>
+          <w:b/>
+          <w:bCs/>
+          <w:kern w:val="0"/>
+          <w:sz w:val="28"/>
+          <w:szCs w:val="32"/>
+          <w14:ligatures w14:val="none"/>
+        </w:rPr>
+        <w:t>FR-0</w:t>
+      </w:r>
+      <w:r>
+        <w:rPr>
+          <w:b/>
+          <w:bCs/>
+          <w:kern w:val="0"/>
+          <w:sz w:val="28"/>
+          <w:szCs w:val="32"/>
+          <w14:ligatures w14:val="none"/>
+        </w:rPr>
+        <w:t>3</w:t>
+      </w:r>
+      <w:r>
+        <w:rPr>
+          <w:kern w:val="0"/>
+          <w:sz w:val="28"/>
+          <w:szCs w:val="32"/>
+          <w14:ligatures w14:val="none"/>
+        </w:rPr>
+        <w:t xml:space="preserve">: </w:t>
+      </w:r>
+      <w:r>
+        <w:rPr>
+          <w:sz w:val="28"/>
+          <w:szCs w:val="32"/>
+        </w:rPr>
+        <w:t>Данные не удаляются при перезапуске приложения.</w:t>
+      </w:r>
+    </w:p>
+    <w:p>
+      <w:pPr>
+        <w:jc w:val="both"/>
+        <w:rPr>
+          <w:sz w:val="28"/>
+          <w:szCs w:val="32"/>
+        </w:rPr>
+      </w:pPr>
+      <w:r>
+        <w:rPr>
+          <w:b/>
+          <w:bCs/>
+          <w:kern w:val="0"/>
+          <w:sz w:val="28"/>
+          <w:szCs w:val="32"/>
+          <w:lang w:val="en-US"/>
+          <w14:ligatures w14:val="none"/>
+        </w:rPr>
+        <w:t>N</w:t>
+      </w:r>
+      <w:r>
+        <w:rPr>
+          <w:b/>
+          <w:bCs/>
+          <w:kern w:val="0"/>
+          <w:sz w:val="28"/>
+          <w:szCs w:val="32"/>
+          <w14:ligatures w14:val="none"/>
+        </w:rPr>
+        <w:t>FR-0</w:t>
+      </w:r>
+      <w:r>
+        <w:rPr>
+          <w:b/>
+          <w:bCs/>
+          <w:kern w:val="0"/>
+          <w:sz w:val="28"/>
+          <w:szCs w:val="32"/>
+          <w14:ligatures w14:val="none"/>
+        </w:rPr>
+        <w:t>4</w:t>
+      </w:r>
+      <w:r>
+        <w:rPr>
+          <w:kern w:val="0"/>
+          <w:sz w:val="28"/>
+          <w:szCs w:val="32"/>
+          <w14:ligatures w14:val="none"/>
+        </w:rPr>
+        <w:t xml:space="preserve">: </w:t>
+      </w:r>
+      <w:r>
+        <w:rPr>
+          <w:sz w:val="28"/>
+          <w:szCs w:val="32"/>
+        </w:rPr>
+        <w:t xml:space="preserve">Запросы к нейросети через </w:t>
+      </w:r>
+      <w:r>
+        <w:rPr>
+          <w:sz w:val="28"/>
+          <w:szCs w:val="32"/>
+          <w:lang w:val="en-US"/>
+        </w:rPr>
+        <w:t>Supabase</w:t>
+      </w:r>
+      <w:r>
+        <w:rPr>
+          <w:sz w:val="28"/>
+          <w:szCs w:val="32"/>
+        </w:rPr>
+        <w:t>, ключи не хранятся локально</w:t>
+      </w:r>
+    </w:p>
+    <w:p>
+      <w:pPr>
+        <w:jc w:val="both"/>
+        <w:rPr>
+          <w:sz w:val="28"/>
+          <w:szCs w:val="32"/>
+        </w:rPr>
+      </w:pPr>
+      <w:r>
+        <w:rPr>
+          <w:b/>
+          <w:bCs/>
+          <w:kern w:val="0"/>
+          <w:sz w:val="28"/>
+          <w:szCs w:val="32"/>
+          <w:lang w:val="en-US"/>
+          <w14:ligatures w14:val="none"/>
+        </w:rPr>
+        <w:t>N</w:t>
+      </w:r>
+      <w:r>
+        <w:rPr>
+          <w:b/>
+          <w:bCs/>
+          <w:kern w:val="0"/>
+          <w:sz w:val="28"/>
+          <w:szCs w:val="32"/>
+          <w14:ligatures w14:val="none"/>
+        </w:rPr>
+        <w:t>FR-0</w:t>
+      </w:r>
+      <w:r>
+        <w:rPr>
+          <w:b/>
+          <w:bCs/>
+          <w:kern w:val="0"/>
+          <w:sz w:val="28"/>
+          <w:szCs w:val="32"/>
+          <w14:ligatures w14:val="none"/>
+        </w:rPr>
+        <w:t>5</w:t>
+      </w:r>
+      <w:r>
+        <w:rPr>
+          <w:kern w:val="0"/>
+          <w:sz w:val="28"/>
+          <w:szCs w:val="32"/>
+          <w14:ligatures w14:val="none"/>
+        </w:rPr>
+        <w:t xml:space="preserve">: </w:t>
+      </w:r>
+      <w:r>
+        <w:rPr>
+          <w:sz w:val="28"/>
+          <w:szCs w:val="32"/>
+        </w:rPr>
+        <w:t>Запрашиваются только необходимые разрешения доступа к телефону.</w:t>
+      </w:r>
+    </w:p>
+    <w:p>
+      <w:pPr>
+        <w:jc w:val="both"/>
+        <w:rPr>
+          <w:sz w:val="28"/>
+          <w:szCs w:val="32"/>
+        </w:rPr>
+      </w:pPr>
+    </w:p>
+    <w:p>
+      <w:pPr>
+        <w:jc w:val="center"/>
+        <w:rPr>
+          <w:sz w:val="28"/>
+          <w:szCs w:val="32"/>
+        </w:rPr>
+      </w:pPr>
+      <w:r>
+        <w:rPr>
+          <w:sz w:val="28"/>
+          <w:szCs w:val="32"/>
+        </w:rPr>
+        <w:t>Истории:</w:t>
+      </w:r>
+    </w:p>
+    <w:p>
+      <w:pPr>
+        <w:jc w:val="both"/>
+        <w:rPr>
+          <w:sz w:val="28"/>
+          <w:szCs w:val="32"/>
+        </w:rPr>
+      </w:pPr>
+      <w:r>
+        <w:rPr>
+          <w:b/>
+          <w:bCs/>
+          <w:sz w:val="28"/>
+          <w:szCs w:val="32"/>
+        </w:rPr>
+        <w:t>US-01</w:t>
+      </w:r>
+      <w:r>
+        <w:rPr>
+          <w:sz w:val="28"/>
+          <w:szCs w:val="32"/>
+        </w:rPr>
+        <w:t>:</w:t>
       </w:r>
       <w:r>
         <w:rPr>
@@ -312,118 +1082,41 @@
           <w:sz w:val="28"/>
           <w:szCs w:val="32"/>
         </w:rPr>
-        <w:t>нейросетью</w:t>
-      </w:r>
-      <w:r>
-        <w:rPr>
-          <w:sz w:val="28"/>
-          <w:szCs w:val="32"/>
-        </w:rPr>
-        <w:t xml:space="preserve"> фотографии на</w:t>
-      </w:r>
-      <w:r>
-        <w:rPr>
-          <w:sz w:val="28"/>
-          <w:szCs w:val="32"/>
-        </w:rPr>
-        <w:t xml:space="preserve"> выполнени</w:t>
-      </w:r>
-      <w:r>
-        <w:rPr>
-          <w:sz w:val="28"/>
-          <w:szCs w:val="32"/>
-        </w:rPr>
-        <w:t xml:space="preserve">е задания </w:t>
-      </w:r>
-    </w:p>
-    <w:p>
-      <w:pPr>
-        <w:jc w:val="both"/>
-        <w:rPr>
-          <w:sz w:val="28"/>
-          <w:szCs w:val="32"/>
-        </w:rPr>
-      </w:pPr>
-      <w:r>
-        <w:rPr>
-          <w:sz w:val="28"/>
-          <w:szCs w:val="32"/>
-        </w:rPr>
-        <w:t>Вывод р</w:t>
-      </w:r>
-      <w:r>
-        <w:rPr>
-          <w:sz w:val="28"/>
-          <w:szCs w:val="32"/>
-        </w:rPr>
-        <w:t>езультат</w:t>
-      </w:r>
-      <w:r>
-        <w:rPr>
-          <w:sz w:val="28"/>
-          <w:szCs w:val="32"/>
-        </w:rPr>
-        <w:t>а по полученному ответу</w:t>
-      </w:r>
-    </w:p>
-    <w:p>
-      <w:pPr>
-        <w:jc w:val="both"/>
-        <w:rPr>
-          <w:sz w:val="28"/>
-          <w:szCs w:val="32"/>
-        </w:rPr>
-      </w:pPr>
-      <w:r>
-        <w:rPr>
-          <w:sz w:val="28"/>
-          <w:szCs w:val="32"/>
-        </w:rPr>
-        <w:t>В</w:t>
-      </w:r>
-      <w:r>
-        <w:rPr>
-          <w:sz w:val="28"/>
-          <w:szCs w:val="32"/>
-        </w:rPr>
-        <w:t>ыполнение в</w:t>
-      </w:r>
-      <w:r>
-        <w:rPr>
-          <w:sz w:val="28"/>
-          <w:szCs w:val="32"/>
-        </w:rPr>
-        <w:t>ибраци</w:t>
-      </w:r>
-      <w:r>
-        <w:rPr>
-          <w:sz w:val="28"/>
-          <w:szCs w:val="32"/>
-        </w:rPr>
-        <w:t>и в зависимости от результата</w:t>
-      </w:r>
-    </w:p>
-    <w:p>
-      <w:pPr>
-        <w:jc w:val="both"/>
-        <w:rPr>
-          <w:sz w:val="28"/>
-          <w:szCs w:val="32"/>
-        </w:rPr>
-      </w:pPr>
-      <w:r>
-        <w:rPr>
-          <w:sz w:val="28"/>
-          <w:szCs w:val="32"/>
-        </w:rPr>
-        <w:t>Сохранение фото</w:t>
-      </w:r>
-      <w:r>
-        <w:rPr>
-          <w:sz w:val="28"/>
-          <w:szCs w:val="32"/>
-        </w:rPr>
-        <w:t>графии</w:t>
+        <w:t>Как пользователь, я хочу фотографировать объект, чтобы выполнять задания.</w:t>
+      </w:r>
+    </w:p>
+    <w:p>
+      <w:pPr>
+        <w:jc w:val="both"/>
+        <w:rPr>
+          <w:sz w:val="28"/>
+          <w:szCs w:val="32"/>
+        </w:rPr>
+      </w:pPr>
+      <w:r>
+        <w:rPr>
+          <w:b/>
+          <w:bCs/>
+          <w:sz w:val="28"/>
+          <w:szCs w:val="32"/>
+        </w:rPr>
+        <w:t>US-0</w:t>
+      </w:r>
+      <w:r>
+        <w:rPr>
+          <w:b/>
+          <w:bCs/>
+          <w:sz w:val="28"/>
+          <w:szCs w:val="32"/>
+        </w:rPr>
+        <w:t>2</w:t>
+      </w:r>
+      <w:r>
+        <w:rPr>
+          <w:sz w:val="28"/>
+          <w:szCs w:val="32"/>
+        </w:rPr>
+        <w:t>:</w:t>
       </w:r>
       <w:r>
         <w:rPr>
@@ -437,104 +1130,48 @@
           <w:sz w:val="28"/>
           <w:szCs w:val="32"/>
         </w:rPr>
-        <w:t xml:space="preserve">с возможностью добавления </w:t>
-      </w:r>
-      <w:proofErr w:type="spellStart"/>
-      <w:r>
-        <w:rPr>
-          <w:sz w:val="28"/>
-          <w:szCs w:val="32"/>
-        </w:rPr>
-        <w:t>геометк</w:t>
-      </w:r>
-      <w:r>
-        <w:rPr>
-          <w:sz w:val="28"/>
-          <w:szCs w:val="32"/>
-        </w:rPr>
-        <w:t>и</w:t>
-      </w:r>
-      <w:proofErr w:type="spellEnd"/>
-    </w:p>
-    <w:p>
-      <w:pPr>
-        <w:jc w:val="both"/>
-        <w:rPr>
-          <w:sz w:val="28"/>
-          <w:szCs w:val="32"/>
-        </w:rPr>
-      </w:pPr>
-      <w:r>
-        <w:rPr>
-          <w:sz w:val="28"/>
-          <w:szCs w:val="32"/>
-        </w:rPr>
-        <w:t>Ведение с</w:t>
-      </w:r>
-      <w:r>
-        <w:rPr>
-          <w:sz w:val="28"/>
-          <w:szCs w:val="32"/>
-        </w:rPr>
-        <w:t>татистик</w:t>
-      </w:r>
-      <w:r>
-        <w:rPr>
-          <w:sz w:val="28"/>
-          <w:szCs w:val="32"/>
-        </w:rPr>
-        <w:t>и по выполнению заданий</w:t>
-      </w:r>
-    </w:p>
-    <w:p>
-      <w:pPr>
-        <w:jc w:val="both"/>
-        <w:rPr>
-          <w:sz w:val="28"/>
-          <w:szCs w:val="32"/>
-        </w:rPr>
-      </w:pPr>
-      <w:r>
-        <w:rPr>
-          <w:sz w:val="28"/>
-          <w:szCs w:val="32"/>
-        </w:rPr>
-        <w:t>Стрик (анимация, поделиться)</w:t>
-      </w:r>
-      <w:r>
-        <w:rPr>
-          <w:sz w:val="28"/>
-          <w:szCs w:val="32"/>
-        </w:rPr>
-        <w:t>. Д</w:t>
-      </w:r>
-      <w:r>
-        <w:rPr>
-          <w:sz w:val="28"/>
-          <w:szCs w:val="32"/>
-        </w:rPr>
-        <w:t>обавляется если</w:t>
-      </w:r>
-      <w:r>
-        <w:rPr>
-          <w:sz w:val="28"/>
-          <w:szCs w:val="32"/>
-        </w:rPr>
-        <w:t xml:space="preserve"> задание выполнено</w:t>
-      </w:r>
-      <w:r>
-        <w:rPr>
-          <w:sz w:val="28"/>
-          <w:szCs w:val="32"/>
-        </w:rPr>
-        <w:t xml:space="preserve"> удачно за </w:t>
-      </w:r>
-      <w:r>
-        <w:rPr>
-          <w:sz w:val="28"/>
-          <w:szCs w:val="32"/>
-        </w:rPr>
-        <w:t>меньше, чем</w:t>
+        <w:t>Как пользователь</w:t>
+      </w:r>
+      <w:r>
+        <w:rPr>
+          <w:sz w:val="28"/>
+          <w:szCs w:val="32"/>
+        </w:rPr>
+        <w:t>, я хочу, чтобы результат появлялся как можно быстрее.</w:t>
+      </w:r>
+    </w:p>
+    <w:p>
+      <w:pPr>
+        <w:jc w:val="both"/>
+        <w:rPr>
+          <w:sz w:val="28"/>
+          <w:szCs w:val="32"/>
+        </w:rPr>
+      </w:pPr>
+      <w:r>
+        <w:rPr>
+          <w:b/>
+          <w:bCs/>
+          <w:sz w:val="28"/>
+          <w:szCs w:val="32"/>
+        </w:rPr>
+        <w:t>US-0</w:t>
+      </w:r>
+      <w:r>
+        <w:rPr>
+          <w:b/>
+          <w:bCs/>
+          <w:sz w:val="28"/>
+          <w:szCs w:val="32"/>
+        </w:rPr>
+        <w:t>3</w:t>
+      </w:r>
+      <w:r>
+        <w:rPr>
+          <w:sz w:val="28"/>
+          <w:szCs w:val="32"/>
+        </w:rPr>
+        <w:t>:</w:t>
       </w:r>
       <w:r>
         <w:rPr>
@@ -548,220 +1185,368 @@
           <w:sz w:val="28"/>
           <w:szCs w:val="32"/>
         </w:rPr>
-        <w:t xml:space="preserve">3 </w:t>
-      </w:r>
-      <w:r>
-        <w:rPr>
-          <w:sz w:val="28"/>
-          <w:szCs w:val="32"/>
-        </w:rPr>
-        <w:t>попытки</w:t>
-      </w:r>
-    </w:p>
-    <w:p>
-      <w:pPr>
-        <w:jc w:val="both"/>
-        <w:rPr>
-          <w:sz w:val="28"/>
-          <w:szCs w:val="32"/>
-        </w:rPr>
-      </w:pPr>
-    </w:p>
-    <w:p>
-      <w:pPr>
-        <w:jc w:val="both"/>
-        <w:rPr>
-          <w:sz w:val="28"/>
-          <w:szCs w:val="32"/>
-        </w:rPr>
-      </w:pPr>
-      <w:r>
-        <w:rPr>
-          <w:sz w:val="28"/>
-          <w:szCs w:val="32"/>
-        </w:rPr>
-        <w:t>Сохранение</w:t>
-      </w:r>
-      <w:r>
-        <w:rPr>
-          <w:sz w:val="28"/>
-          <w:szCs w:val="32"/>
-        </w:rPr>
-        <w:t xml:space="preserve"> текущего</w:t>
-      </w:r>
-      <w:r>
-        <w:rPr>
-          <w:sz w:val="28"/>
-          <w:szCs w:val="32"/>
-        </w:rPr>
-        <w:t xml:space="preserve"> задания и фото в оффлайн</w:t>
-      </w:r>
-      <w:r>
-        <w:rPr>
-          <w:sz w:val="28"/>
-          <w:szCs w:val="32"/>
-        </w:rPr>
-        <w:t xml:space="preserve"> (по возможности)</w:t>
-      </w:r>
-    </w:p>
-    <w:p>
-      <w:pPr>
-        <w:jc w:val="both"/>
-        <w:rPr>
-          <w:sz w:val="28"/>
-          <w:szCs w:val="32"/>
-        </w:rPr>
-      </w:pPr>
-      <w:r>
-        <w:rPr>
-          <w:sz w:val="28"/>
-          <w:szCs w:val="32"/>
-        </w:rPr>
-        <w:t>Повтор или отмена при ошибке нейросети (без сброса прогресса)</w:t>
-      </w:r>
-    </w:p>
-    <w:p>
-      <w:pPr>
-        <w:jc w:val="both"/>
-        <w:rPr>
-          <w:sz w:val="28"/>
-          <w:szCs w:val="32"/>
-        </w:rPr>
-      </w:pPr>
-      <w:r>
-        <w:rPr>
-          <w:sz w:val="28"/>
-          <w:szCs w:val="32"/>
-        </w:rPr>
-        <w:t>Предупреждение при неадекватном фото</w:t>
-      </w:r>
-    </w:p>
-    <w:p>
-      <w:pPr>
-        <w:jc w:val="both"/>
-        <w:rPr>
-          <w:sz w:val="28"/>
-          <w:szCs w:val="32"/>
-        </w:rPr>
-      </w:pPr>
-    </w:p>
-    <w:p>
-      <w:pPr>
-        <w:jc w:val="both"/>
-        <w:rPr>
-          <w:sz w:val="28"/>
-          <w:szCs w:val="32"/>
-        </w:rPr>
-      </w:pPr>
-      <w:r>
-        <w:rPr>
-          <w:sz w:val="28"/>
-          <w:szCs w:val="32"/>
+        <w:t>Как пользователь, я хочу сохранение фотографий, чтобы можно было не делать их по новой.</w:t>
+      </w:r>
+    </w:p>
+    <w:p>
+      <w:pPr>
+        <w:jc w:val="both"/>
+        <w:rPr>
+          <w:sz w:val="28"/>
+          <w:szCs w:val="32"/>
+        </w:rPr>
+      </w:pPr>
+      <w:r>
+        <w:rPr>
+          <w:b/>
+          <w:bCs/>
+          <w:sz w:val="28"/>
+          <w:szCs w:val="32"/>
+        </w:rPr>
+        <w:t>US-0</w:t>
+      </w:r>
+      <w:r>
+        <w:rPr>
+          <w:b/>
+          <w:bCs/>
+          <w:sz w:val="28"/>
+          <w:szCs w:val="32"/>
+        </w:rPr>
+        <w:t>4</w:t>
+      </w:r>
+      <w:r>
+        <w:rPr>
+          <w:sz w:val="28"/>
+          <w:szCs w:val="32"/>
+        </w:rPr>
+        <w:t>:</w:t>
+      </w:r>
+      <w:r>
+        <w:rPr>
+          <w:sz w:val="28"/>
+          <w:szCs w:val="32"/>
+        </w:rPr>
+        <w:t xml:space="preserve"> </w:t>
+      </w:r>
+      <w:r>
+        <w:rPr>
+          <w:sz w:val="28"/>
+          <w:szCs w:val="32"/>
+        </w:rPr>
+        <w:t>Как пользователь, я хочу</w:t>
+      </w:r>
+      <w:r>
+        <w:rPr>
+          <w:sz w:val="28"/>
+          <w:szCs w:val="32"/>
+        </w:rPr>
+        <w:t xml:space="preserve"> отдельную статистику</w:t>
+      </w:r>
+      <w:r>
+        <w:rPr>
+          <w:sz w:val="28"/>
+          <w:szCs w:val="32"/>
+        </w:rPr>
+        <w:t>, чтобы мои результаты были видны мне в доступной форме.</w:t>
+      </w:r>
+    </w:p>
+    <w:p>
+      <w:pPr>
+        <w:jc w:val="both"/>
+        <w:rPr>
+          <w:sz w:val="28"/>
+          <w:szCs w:val="32"/>
+        </w:rPr>
+      </w:pPr>
+      <w:r>
+        <w:rPr>
+          <w:b/>
+          <w:bCs/>
+          <w:sz w:val="28"/>
+          <w:szCs w:val="32"/>
+        </w:rPr>
+        <w:t>US-0</w:t>
+      </w:r>
+      <w:r>
+        <w:rPr>
+          <w:b/>
+          <w:bCs/>
+          <w:sz w:val="28"/>
+          <w:szCs w:val="32"/>
+        </w:rPr>
+        <w:t>5</w:t>
+      </w:r>
+      <w:r>
+        <w:rPr>
+          <w:sz w:val="28"/>
+          <w:szCs w:val="32"/>
+        </w:rPr>
+        <w:t>:</w:t>
+      </w:r>
+      <w:r>
+        <w:rPr>
+          <w:sz w:val="28"/>
+          <w:szCs w:val="32"/>
+        </w:rPr>
+        <w:t xml:space="preserve"> </w:t>
+      </w:r>
+      <w:r>
+        <w:rPr>
+          <w:sz w:val="28"/>
+          <w:szCs w:val="32"/>
+        </w:rPr>
+        <w:t xml:space="preserve">Как пользователь, я хочу карту фотографий, чтобы можно было </w:t>
+      </w:r>
+      <w:r>
+        <w:rPr>
+          <w:sz w:val="28"/>
+          <w:szCs w:val="32"/>
+        </w:rPr>
+        <w:t>посмотреть,</w:t>
+      </w:r>
+      <w:r>
+        <w:rPr>
+          <w:sz w:val="28"/>
+          <w:szCs w:val="32"/>
+        </w:rPr>
+        <w:t xml:space="preserve"> где они сделаны.</w:t>
+      </w:r>
+    </w:p>
+    <w:p>
+      <w:pPr>
+        <w:rPr>
+          <w:sz w:val="28"/>
+          <w:szCs w:val="32"/>
+        </w:rPr>
+      </w:pPr>
+      <w:r>
+        <w:rPr>
+          <w:sz w:val="28"/>
+          <w:szCs w:val="32"/>
+        </w:rPr>
+        <w:br w:type="page"/>
+      </w:r>
+    </w:p>
+    <w:p>
+      <w:pPr>
+        <w:jc w:val="center"/>
+        <w:rPr>
+          <w:sz w:val="28"/>
+          <w:szCs w:val="32"/>
+          <w:lang w:val="en-US"/>
+        </w:rPr>
+      </w:pPr>
+      <w:r>
+        <w:rPr>
+          <w:sz w:val="28"/>
+          <w:szCs w:val="32"/>
+          <w:lang w:val="en-US"/>
         </w:rPr>
         <w:lastRenderedPageBreak/>
-        <w:t>Нефункциональные:</w:t>
-      </w:r>
-    </w:p>
-    <w:p>
-      <w:pPr>
-        <w:jc w:val="both"/>
-        <w:rPr>
-          <w:sz w:val="28"/>
-          <w:szCs w:val="32"/>
-        </w:rPr>
-      </w:pPr>
-      <w:r>
-        <w:rPr>
-          <w:sz w:val="28"/>
-          <w:szCs w:val="32"/>
-        </w:rPr>
-        <w:t>Максимально снизить задержку между пользователем и нейросетью. Максимум 5-10 секунд. Не учитывать скорость соединения пользователя.</w:t>
-      </w:r>
-    </w:p>
-    <w:p>
-      <w:pPr>
-        <w:jc w:val="both"/>
-        <w:rPr>
-          <w:sz w:val="28"/>
-          <w:szCs w:val="32"/>
-        </w:rPr>
-      </w:pPr>
-      <w:r>
-        <w:rPr>
-          <w:sz w:val="28"/>
-          <w:szCs w:val="32"/>
-        </w:rPr>
-        <w:t>Добавить элементы загрузки для наглядности. (Нет ощущения остановки приложения).</w:t>
-      </w:r>
-    </w:p>
-    <w:p>
-      <w:pPr>
-        <w:jc w:val="both"/>
-        <w:rPr>
-          <w:sz w:val="28"/>
-          <w:szCs w:val="32"/>
-        </w:rPr>
-      </w:pPr>
-      <w:r>
-        <w:rPr>
-          <w:sz w:val="28"/>
-          <w:szCs w:val="32"/>
-        </w:rPr>
-        <w:t>Данные не удаляются при перезапуске приложения.</w:t>
-      </w:r>
-    </w:p>
-    <w:p>
-      <w:pPr>
-        <w:jc w:val="both"/>
-        <w:rPr>
-          <w:sz w:val="28"/>
-          <w:szCs w:val="32"/>
-        </w:rPr>
-      </w:pPr>
-      <w:r>
-        <w:rPr>
-          <w:sz w:val="28"/>
-          <w:szCs w:val="32"/>
-        </w:rPr>
-        <w:t xml:space="preserve">Запросы к нейросети через </w:t>
-      </w:r>
-      <w:proofErr w:type="spellStart"/>
-      <w:r>
-        <w:rPr>
-          <w:sz w:val="28"/>
-          <w:szCs w:val="32"/>
-          <w:lang w:val="en-US"/>
-        </w:rPr>
-        <w:t>Supabase</w:t>
-      </w:r>
-      <w:proofErr w:type="spellEnd"/>
-      <w:r>
-        <w:rPr>
-          <w:sz w:val="28"/>
-          <w:szCs w:val="32"/>
-        </w:rPr>
-        <w:t>, ключи не хранятся локально</w:t>
-      </w:r>
-    </w:p>
-    <w:p>
-      <w:pPr>
-        <w:jc w:val="both"/>
-        <w:rPr>
-          <w:sz w:val="28"/>
-          <w:szCs w:val="32"/>
-        </w:rPr>
-      </w:pPr>
-      <w:r>
-        <w:rPr>
-          <w:sz w:val="28"/>
-          <w:szCs w:val="32"/>
-        </w:rPr>
-        <w:t>Запрашиваются только необходимые разрешения доступа к телефону.</w:t>
-      </w:r>
-    </w:p>
-    <w:p>
-      <w:pPr>
-        <w:jc w:val="both"/>
+        <w:t>MoSCoW:</w:t>
+      </w:r>
+    </w:p>
+    <w:tbl>
+      <w:tblPr>
+        <w:tblStyle w:val="ad"/>
+        <w:tblW w:w="0" w:type="auto"/>
+        <w:tblLook w:val="04A0" w:firstRow="1" w:lastRow="0" w:firstColumn="1" w:lastColumn="0" w:noHBand="0" w:noVBand="1"/>
+      </w:tblPr>
+      <w:tblGrid>
+        <w:gridCol w:w="4672"/>
+        <w:gridCol w:w="4673"/>
+      </w:tblGrid>
+      <w:tr>
+        <w:tc>
+          <w:tcPr>
+            <w:tcW w:w="4672" w:type="dxa"/>
+          </w:tcPr>
+          <w:p>
+            <w:pPr>
+              <w:jc w:val="both"/>
+              <w:rPr>
+                <w:sz w:val="28"/>
+                <w:szCs w:val="32"/>
+                <w:lang w:val="en-US"/>
+              </w:rPr>
+            </w:pPr>
+            <w:r>
+              <w:rPr>
+                <w:sz w:val="28"/>
+                <w:szCs w:val="32"/>
+                <w:lang w:val="en-US"/>
+              </w:rPr>
+              <w:t>Must</w:t>
+            </w:r>
+          </w:p>
+        </w:tc>
+        <w:tc>
+          <w:tcPr>
+            <w:tcW w:w="4673" w:type="dxa"/>
+          </w:tcPr>
+          <w:p>
+            <w:pPr>
+              <w:jc w:val="both"/>
+              <w:rPr>
+                <w:sz w:val="28"/>
+                <w:szCs w:val="32"/>
+                <w:lang w:val="en-US"/>
+              </w:rPr>
+            </w:pPr>
+            <w:r>
+              <w:rPr>
+                <w:sz w:val="28"/>
+                <w:szCs w:val="32"/>
+                <w:lang w:val="en-US"/>
+              </w:rPr>
+              <w:t>FR-01-FR-07</w:t>
+            </w:r>
+          </w:p>
+        </w:tc>
+      </w:tr>
+      <w:tr>
+        <w:tc>
+          <w:tcPr>
+            <w:tcW w:w="4672" w:type="dxa"/>
+          </w:tcPr>
+          <w:p>
+            <w:pPr>
+              <w:jc w:val="both"/>
+              <w:rPr>
+                <w:sz w:val="28"/>
+                <w:szCs w:val="32"/>
+                <w:lang w:val="en-US"/>
+              </w:rPr>
+            </w:pPr>
+            <w:r>
+              <w:rPr>
+                <w:sz w:val="28"/>
+                <w:szCs w:val="32"/>
+                <w:lang w:val="en-US"/>
+              </w:rPr>
+              <w:t>Should</w:t>
+            </w:r>
+          </w:p>
+        </w:tc>
+        <w:tc>
+          <w:tcPr>
+            <w:tcW w:w="4673" w:type="dxa"/>
+          </w:tcPr>
+          <w:p>
+            <w:pPr>
+              <w:jc w:val="both"/>
+              <w:rPr>
+                <w:sz w:val="28"/>
+                <w:szCs w:val="32"/>
+                <w:lang w:val="en-US"/>
+              </w:rPr>
+            </w:pPr>
+            <w:r>
+              <w:rPr>
+                <w:sz w:val="28"/>
+                <w:szCs w:val="32"/>
+                <w:lang w:val="en-US"/>
+              </w:rPr>
+              <w:t>FR-08-FR-13</w:t>
+            </w:r>
+          </w:p>
+        </w:tc>
+      </w:tr>
+      <w:tr>
+        <w:tc>
+          <w:tcPr>
+            <w:tcW w:w="4672" w:type="dxa"/>
+          </w:tcPr>
+          <w:p>
+            <w:pPr>
+              <w:jc w:val="both"/>
+              <w:rPr>
+                <w:sz w:val="28"/>
+                <w:szCs w:val="32"/>
+                <w:lang w:val="en-US"/>
+              </w:rPr>
+            </w:pPr>
+            <w:r>
+              <w:rPr>
+                <w:sz w:val="28"/>
+                <w:szCs w:val="32"/>
+                <w:lang w:val="en-US"/>
+              </w:rPr>
+              <w:t>Could</w:t>
+            </w:r>
+          </w:p>
+        </w:tc>
+        <w:tc>
+          <w:tcPr>
+            <w:tcW w:w="4673" w:type="dxa"/>
+          </w:tcPr>
+          <w:p>
+            <w:pPr>
+              <w:jc w:val="both"/>
+              <w:rPr>
+                <w:sz w:val="28"/>
+                <w:szCs w:val="32"/>
+              </w:rPr>
+            </w:pPr>
+            <w:r>
+              <w:rPr>
+                <w:sz w:val="28"/>
+                <w:szCs w:val="32"/>
+              </w:rPr>
+              <w:t>Карта с фотографиями, лучшие фотографии</w:t>
+            </w:r>
+          </w:p>
+        </w:tc>
+      </w:tr>
+      <w:tr>
+        <w:tc>
+          <w:tcPr>
+            <w:tcW w:w="4672" w:type="dxa"/>
+          </w:tcPr>
+          <w:p>
+            <w:pPr>
+              <w:jc w:val="both"/>
+              <w:rPr>
+                <w:sz w:val="28"/>
+                <w:szCs w:val="32"/>
+                <w:lang w:val="en-US"/>
+              </w:rPr>
+            </w:pPr>
+            <w:r>
+              <w:rPr>
+                <w:sz w:val="28"/>
+                <w:szCs w:val="32"/>
+                <w:lang w:val="en-US"/>
+              </w:rPr>
+              <w:t>Won’t</w:t>
+            </w:r>
+          </w:p>
+        </w:tc>
+        <w:tc>
+          <w:tcPr>
+            <w:tcW w:w="4673" w:type="dxa"/>
+          </w:tcPr>
+          <w:p>
+            <w:pPr>
+              <w:jc w:val="both"/>
+              <w:rPr>
+                <w:sz w:val="28"/>
+                <w:szCs w:val="32"/>
+              </w:rPr>
+            </w:pPr>
+            <w:r>
+              <w:rPr>
+                <w:sz w:val="28"/>
+                <w:szCs w:val="32"/>
+              </w:rPr>
+              <w:t>Мультиплеер, рейтинг</w:t>
+            </w:r>
+          </w:p>
+        </w:tc>
+      </w:tr>
+    </w:tbl>
+    <w:p>
+      <w:pPr>
         <w:rPr>
           <w:sz w:val="28"/>
           <w:szCs w:val="32"/>
@@ -781,154 +1566,6 @@
           <w:sz w:val="28"/>
           <w:szCs w:val="32"/>
         </w:rPr>
-        <w:t>Истории:</w:t>
-      </w:r>
-    </w:p>
-    <w:p>
-      <w:pPr>
-        <w:jc w:val="both"/>
-        <w:rPr>
-          <w:sz w:val="28"/>
-          <w:szCs w:val="32"/>
-        </w:rPr>
-      </w:pPr>
-      <w:r>
-        <w:rPr>
-          <w:sz w:val="28"/>
-          <w:szCs w:val="32"/>
-        </w:rPr>
-        <w:t>Как пользователь, я хочу фотографировать объект, чтобы выполнять задания.</w:t>
-      </w:r>
-    </w:p>
-    <w:p>
-      <w:pPr>
-        <w:jc w:val="both"/>
-        <w:rPr>
-          <w:sz w:val="28"/>
-          <w:szCs w:val="32"/>
-        </w:rPr>
-      </w:pPr>
-      <w:r>
-        <w:rPr>
-          <w:sz w:val="28"/>
-          <w:szCs w:val="32"/>
-        </w:rPr>
-        <w:t>Как пользователь</w:t>
-      </w:r>
-      <w:r>
-        <w:rPr>
-          <w:sz w:val="28"/>
-          <w:szCs w:val="32"/>
-        </w:rPr>
-        <w:t>, я хочу, чтобы результат появлялся как можно быстрее.</w:t>
-      </w:r>
-    </w:p>
-    <w:p>
-      <w:pPr>
-        <w:jc w:val="both"/>
-        <w:rPr>
-          <w:sz w:val="28"/>
-          <w:szCs w:val="32"/>
-        </w:rPr>
-      </w:pPr>
-      <w:r>
-        <w:rPr>
-          <w:sz w:val="28"/>
-          <w:szCs w:val="32"/>
-        </w:rPr>
-        <w:t>Как пользователь, я хочу сохранение фотографий, чтобы можно было не делать их по новой.</w:t>
-      </w:r>
-    </w:p>
-    <w:p>
-      <w:pPr>
-        <w:jc w:val="both"/>
-        <w:rPr>
-          <w:sz w:val="28"/>
-          <w:szCs w:val="32"/>
-        </w:rPr>
-      </w:pPr>
-      <w:r>
-        <w:rPr>
-          <w:sz w:val="28"/>
-          <w:szCs w:val="32"/>
-        </w:rPr>
-        <w:t>Как пользователь, я хочу</w:t>
-      </w:r>
-      <w:r>
-        <w:rPr>
-          <w:sz w:val="28"/>
-          <w:szCs w:val="32"/>
-        </w:rPr>
-        <w:t xml:space="preserve"> отдельную статистику</w:t>
-      </w:r>
-      <w:r>
-        <w:rPr>
-          <w:sz w:val="28"/>
-          <w:szCs w:val="32"/>
-        </w:rPr>
-        <w:t>, чтобы мои результаты были видны мне в доступной форме.</w:t>
-      </w:r>
-    </w:p>
-    <w:p>
-      <w:pPr>
-        <w:jc w:val="both"/>
-        <w:rPr>
-          <w:sz w:val="28"/>
-          <w:szCs w:val="32"/>
-        </w:rPr>
-      </w:pPr>
-      <w:r>
-        <w:rPr>
-          <w:sz w:val="28"/>
-          <w:szCs w:val="32"/>
-        </w:rPr>
-        <w:t xml:space="preserve">Как пользователь, я хочу карту фотографий, чтобы можно было </w:t>
-      </w:r>
-      <w:r>
-        <w:rPr>
-          <w:sz w:val="28"/>
-          <w:szCs w:val="32"/>
-        </w:rPr>
-        <w:t>посмотреть,</w:t>
-      </w:r>
-      <w:r>
-        <w:rPr>
-          <w:sz w:val="28"/>
-          <w:szCs w:val="32"/>
-        </w:rPr>
-        <w:t xml:space="preserve"> где они сделаны.</w:t>
-      </w:r>
-    </w:p>
-    <w:p>
-      <w:pPr>
-        <w:rPr>
-          <w:sz w:val="28"/>
-          <w:szCs w:val="32"/>
-          <w:lang w:val="en-US"/>
-        </w:rPr>
-      </w:pPr>
-      <w:r>
-        <w:rPr>
-          <w:sz w:val="28"/>
-          <w:szCs w:val="32"/>
-        </w:rPr>
-        <w:br w:type="page"/>
-      </w:r>
-    </w:p>
-    <w:p>
-      <w:pPr>
-        <w:jc w:val="center"/>
-        <w:rPr>
-          <w:sz w:val="28"/>
-          <w:szCs w:val="32"/>
-        </w:rPr>
-      </w:pPr>
-      <w:r>
-        <w:rPr>
-          <w:sz w:val="28"/>
-          <w:szCs w:val="32"/>
-        </w:rPr>
-        <w:lastRenderedPageBreak/>
         <w:t>Диаграмма:</w:t>
       </w:r>
     </w:p>
@@ -966,7 +1603,7 @@
                     </pic:cNvPicPr>
                   </pic:nvPicPr>
                   <pic:blipFill>
-                    <a:blip r:embed="rId4" cstate="print">
+                    <a:blip r:embed="rId5" cstate="print">
                       <a:extLst>
                         <a:ext uri="{28A0092B-C50C-407E-A947-70E740481C1C}">
                           <a14:useLocalDpi xmlns:a14="http://schemas.microsoft.com/office/drawing/2010/main" val="0"/>
@@ -1003,6 +1640,359 @@
     </w:sectPr>
   </w:body>
 </w:document>
+</file>
+
+<file path=word/numbering.xml><?xml version="1.0" encoding="utf-8"?>
+<w:numbering xmlns:wpc="http://schemas.microsoft.com/office/word/2010/wordprocessingCanvas" xmlns:cx="http://schemas.microsoft.com/office/drawing/2014/chartex" xmlns:cx1="http://schemas.microsoft.com/office/drawing/2015/9/8/chartex" xmlns:cx2="http://schemas.microsoft.com/office/drawing/2015/10/21/chartex" xmlns:cx3="http://schemas.microsoft.com/office/drawing/2016/5/9/chartex" xmlns:cx4="http://schemas.microsoft.com/office/drawing/2016/5/10/chartex" xmlns:cx5="http://schemas.microsoft.com/office/drawing/2016/5/11/chartex" xmlns:cx6="http://schemas.microsoft.com/office/drawing/2016/5/12/chartex" xmlns:cx7="http://schemas.microsoft.com/office/drawing/2016/5/13/chartex" xmlns:cx8="http://schemas.microsoft.com/office/drawing/2016/5/14/chartex" xmlns:mc="http://schemas.openxmlformats.org/markup-compatibility/2006" xmlns:aink="http://schemas.microsoft.com/office/drawing/2016/ink" xmlns:am3d="http://schemas.microsoft.com/office/drawing/2017/model3d" xmlns:o="urn:schemas-microsoft-com:office:office" xmlns:r="http://schemas.openxmlformats.org/officeDocument/2006/relationships" xmlns:m="http://schemas.openxmlformats.org/officeDocument/2006/math" xmlns:v="urn:schemas-microsoft-com:vml" xmlns:wp14="http://schemas.microsoft.com/office/word/2010/wordprocessingDrawing" xmlns:wp="http://schemas.openxmlformats.org/drawingml/2006/wordprocessingDrawing" xmlns:w10="urn:schemas-microsoft-com:office:word" xmlns:w="http://schemas.openxmlformats.org/wordprocessingml/2006/main" xmlns:w14="http://schemas.microsoft.com/office/word/2010/wordml" xmlns:w15="http://schemas.microsoft.com/office/word/2012/wordml" xmlns:w16cex="http://schemas.microsoft.com/office/word/2018/wordml/cex" xmlns:w16cid="http://schemas.microsoft.com/office/word/2016/wordml/cid" xmlns:w16="http://schemas.microsoft.com/office/word/2018/wordml" xmlns:w16sdtdh="http://schemas.microsoft.com/office/word/2020/wordml/sdtdatahash" xmlns:w16se="http://schemas.microsoft.com/office/word/2015/wordml/symex" xmlns:wpg="http://schemas.microsoft.com/office/word/2010/wordprocessingGroup" xmlns:wpi="http://schemas.microsoft.com/office/word/2010/wordprocessingInk" xmlns:wne="http://schemas.microsoft.com/office/word/2006/wordml" xmlns:wps="http://schemas.microsoft.com/office/word/2010/wordprocessingShape" mc:Ignorable="w14 w15 w16se w16cid w16 w16cex w16sdtdh wp14">
+  <w:abstractNum w:abstractNumId="0" w15:restartNumberingAfterBreak="0">
+    <w:nsid w:val="1B8D1FAB"/>
+    <w:multiLevelType w:val="multilevel"/>
+    <w:tmpl w:val="436603A4"/>
+    <w:lvl w:ilvl="0">
+      <w:start w:val="1"/>
+      <w:numFmt w:val="decimal"/>
+      <w:lvlText w:val="%1."/>
+      <w:lvlJc w:val="left"/>
+      <w:pPr>
+        <w:tabs>
+          <w:tab w:val="num" w:pos="720"/>
+        </w:tabs>
+        <w:ind w:left="720" w:hanging="360"/>
+      </w:pPr>
+    </w:lvl>
+    <w:lvl w:ilvl="1" w:tentative="1">
+      <w:start w:val="1"/>
+      <w:numFmt w:val="decimal"/>
+      <w:lvlText w:val="%2."/>
+      <w:lvlJc w:val="left"/>
+      <w:pPr>
+        <w:tabs>
+          <w:tab w:val="num" w:pos="1440"/>
+        </w:tabs>
+        <w:ind w:left="1440" w:hanging="360"/>
+      </w:pPr>
+    </w:lvl>
+    <w:lvl w:ilvl="2" w:tentative="1">
+      <w:start w:val="1"/>
+      <w:numFmt w:val="decimal"/>
+      <w:lvlText w:val="%3."/>
+      <w:lvlJc w:val="left"/>
+      <w:pPr>
+        <w:tabs>
+          <w:tab w:val="num" w:pos="2160"/>
+        </w:tabs>
+        <w:ind w:left="2160" w:hanging="360"/>
+      </w:pPr>
+    </w:lvl>
+    <w:lvl w:ilvl="3" w:tentative="1">
+      <w:start w:val="1"/>
+      <w:numFmt w:val="decimal"/>
+      <w:lvlText w:val="%4."/>
+      <w:lvlJc w:val="left"/>
+      <w:pPr>
+        <w:tabs>
+          <w:tab w:val="num" w:pos="2880"/>
+        </w:tabs>
+        <w:ind w:left="2880" w:hanging="360"/>
+      </w:pPr>
+    </w:lvl>
+    <w:lvl w:ilvl="4" w:tentative="1">
+      <w:start w:val="1"/>
+      <w:numFmt w:val="decimal"/>
+      <w:lvlText w:val="%5."/>
+      <w:lvlJc w:val="left"/>
+      <w:pPr>
+        <w:tabs>
+          <w:tab w:val="num" w:pos="3600"/>
+        </w:tabs>
+        <w:ind w:left="3600" w:hanging="360"/>
+      </w:pPr>
+    </w:lvl>
+    <w:lvl w:ilvl="5" w:tentative="1">
+      <w:start w:val="1"/>
+      <w:numFmt w:val="decimal"/>
+      <w:lvlText w:val="%6."/>
+      <w:lvlJc w:val="left"/>
+      <w:pPr>
+        <w:tabs>
+          <w:tab w:val="num" w:pos="4320"/>
+        </w:tabs>
+        <w:ind w:left="4320" w:hanging="360"/>
+      </w:pPr>
+    </w:lvl>
+    <w:lvl w:ilvl="6" w:tentative="1">
+      <w:start w:val="1"/>
+      <w:numFmt w:val="decimal"/>
+      <w:lvlText w:val="%7."/>
+      <w:lvlJc w:val="left"/>
+      <w:pPr>
+        <w:tabs>
+          <w:tab w:val="num" w:pos="5040"/>
+        </w:tabs>
+        <w:ind w:left="5040" w:hanging="360"/>
+      </w:pPr>
+    </w:lvl>
+    <w:lvl w:ilvl="7" w:tentative="1">
+      <w:start w:val="1"/>
+      <w:numFmt w:val="decimal"/>
+      <w:lvlText w:val="%8."/>
+      <w:lvlJc w:val="left"/>
+      <w:pPr>
+        <w:tabs>
+          <w:tab w:val="num" w:pos="5760"/>
+        </w:tabs>
+        <w:ind w:left="5760" w:hanging="360"/>
+      </w:pPr>
+    </w:lvl>
+    <w:lvl w:ilvl="8" w:tentative="1">
+      <w:start w:val="1"/>
+      <w:numFmt w:val="decimal"/>
+      <w:lvlText w:val="%9."/>
+      <w:lvlJc w:val="left"/>
+      <w:pPr>
+        <w:tabs>
+          <w:tab w:val="num" w:pos="6480"/>
+        </w:tabs>
+        <w:ind w:left="6480" w:hanging="360"/>
+      </w:pPr>
+    </w:lvl>
+  </w:abstractNum>
+  <w:abstractNum w:abstractNumId="1" w15:restartNumberingAfterBreak="0">
+    <w:nsid w:val="2C487B0B"/>
+    <w:multiLevelType w:val="multilevel"/>
+    <w:tmpl w:val="5414F1CA"/>
+    <w:lvl w:ilvl="0">
+      <w:start w:val="1"/>
+      <w:numFmt w:val="decimal"/>
+      <w:lvlText w:val="%1."/>
+      <w:lvlJc w:val="left"/>
+      <w:pPr>
+        <w:tabs>
+          <w:tab w:val="num" w:pos="720"/>
+        </w:tabs>
+        <w:ind w:left="720" w:hanging="360"/>
+      </w:pPr>
+    </w:lvl>
+    <w:lvl w:ilvl="1" w:tentative="1">
+      <w:start w:val="1"/>
+      <w:numFmt w:val="decimal"/>
+      <w:lvlText w:val="%2."/>
+      <w:lvlJc w:val="left"/>
+      <w:pPr>
+        <w:tabs>
+          <w:tab w:val="num" w:pos="1440"/>
+        </w:tabs>
+        <w:ind w:left="1440" w:hanging="360"/>
+      </w:pPr>
+    </w:lvl>
+    <w:lvl w:ilvl="2" w:tentative="1">
+      <w:start w:val="1"/>
+      <w:numFmt w:val="decimal"/>
+      <w:lvlText w:val="%3."/>
+      <w:lvlJc w:val="left"/>
+      <w:pPr>
+        <w:tabs>
+          <w:tab w:val="num" w:pos="2160"/>
+        </w:tabs>
+        <w:ind w:left="2160" w:hanging="360"/>
+      </w:pPr>
+    </w:lvl>
+    <w:lvl w:ilvl="3" w:tentative="1">
+      <w:start w:val="1"/>
+      <w:numFmt w:val="decimal"/>
+      <w:lvlText w:val="%4."/>
+      <w:lvlJc w:val="left"/>
+      <w:pPr>
+        <w:tabs>
+          <w:tab w:val="num" w:pos="2880"/>
+        </w:tabs>
+        <w:ind w:left="2880" w:hanging="360"/>
+      </w:pPr>
+    </w:lvl>
+    <w:lvl w:ilvl="4" w:tentative="1">
+      <w:start w:val="1"/>
+      <w:numFmt w:val="decimal"/>
+      <w:lvlText w:val="%5."/>
+      <w:lvlJc w:val="left"/>
+      <w:pPr>
+        <w:tabs>
+          <w:tab w:val="num" w:pos="3600"/>
+        </w:tabs>
+        <w:ind w:left="3600" w:hanging="360"/>
+      </w:pPr>
+    </w:lvl>
+    <w:lvl w:ilvl="5" w:tentative="1">
+      <w:start w:val="1"/>
+      <w:numFmt w:val="decimal"/>
+      <w:lvlText w:val="%6."/>
+      <w:lvlJc w:val="left"/>
+      <w:pPr>
+        <w:tabs>
+          <w:tab w:val="num" w:pos="4320"/>
+        </w:tabs>
+        <w:ind w:left="4320" w:hanging="360"/>
+      </w:pPr>
+    </w:lvl>
+    <w:lvl w:ilvl="6" w:tentative="1">
+      <w:start w:val="1"/>
+      <w:numFmt w:val="decimal"/>
+      <w:lvlText w:val="%7."/>
+      <w:lvlJc w:val="left"/>
+      <w:pPr>
+        <w:tabs>
+          <w:tab w:val="num" w:pos="5040"/>
+        </w:tabs>
+        <w:ind w:left="5040" w:hanging="360"/>
+      </w:pPr>
+    </w:lvl>
+    <w:lvl w:ilvl="7" w:tentative="1">
+      <w:start w:val="1"/>
+      <w:numFmt w:val="decimal"/>
+      <w:lvlText w:val="%8."/>
+      <w:lvlJc w:val="left"/>
+      <w:pPr>
+        <w:tabs>
+          <w:tab w:val="num" w:pos="5760"/>
+        </w:tabs>
+        <w:ind w:left="5760" w:hanging="360"/>
+      </w:pPr>
+    </w:lvl>
+    <w:lvl w:ilvl="8" w:tentative="1">
+      <w:start w:val="1"/>
+      <w:numFmt w:val="decimal"/>
+      <w:lvlText w:val="%9."/>
+      <w:lvlJc w:val="left"/>
+      <w:pPr>
+        <w:tabs>
+          <w:tab w:val="num" w:pos="6480"/>
+        </w:tabs>
+        <w:ind w:left="6480" w:hanging="360"/>
+      </w:pPr>
+    </w:lvl>
+  </w:abstractNum>
+  <w:abstractNum w:abstractNumId="2" w15:restartNumberingAfterBreak="0">
+    <w:nsid w:val="2F1D201A"/>
+    <w:multiLevelType w:val="multilevel"/>
+    <w:tmpl w:val="64404732"/>
+    <w:lvl w:ilvl="0">
+      <w:start w:val="1"/>
+      <w:numFmt w:val="decimal"/>
+      <w:lvlText w:val="%1."/>
+      <w:lvlJc w:val="left"/>
+      <w:pPr>
+        <w:tabs>
+          <w:tab w:val="num" w:pos="720"/>
+        </w:tabs>
+        <w:ind w:left="720" w:hanging="360"/>
+      </w:pPr>
+    </w:lvl>
+    <w:lvl w:ilvl="1" w:tentative="1">
+      <w:start w:val="1"/>
+      <w:numFmt w:val="decimal"/>
+      <w:lvlText w:val="%2."/>
+      <w:lvlJc w:val="left"/>
+      <w:pPr>
+        <w:tabs>
+          <w:tab w:val="num" w:pos="1440"/>
+        </w:tabs>
+        <w:ind w:left="1440" w:hanging="360"/>
+      </w:pPr>
+    </w:lvl>
+    <w:lvl w:ilvl="2" w:tentative="1">
+      <w:start w:val="1"/>
+      <w:numFmt w:val="decimal"/>
+      <w:lvlText w:val="%3."/>
+      <w:lvlJc w:val="left"/>
+      <w:pPr>
+        <w:tabs>
+          <w:tab w:val="num" w:pos="2160"/>
+        </w:tabs>
+        <w:ind w:left="2160" w:hanging="360"/>
+      </w:pPr>
+    </w:lvl>
+    <w:lvl w:ilvl="3" w:tentative="1">
+      <w:start w:val="1"/>
+      <w:numFmt w:val="decimal"/>
+      <w:lvlText w:val="%4."/>
+      <w:lvlJc w:val="left"/>
+      <w:pPr>
+        <w:tabs>
+          <w:tab w:val="num" w:pos="2880"/>
+        </w:tabs>
+        <w:ind w:left="2880" w:hanging="360"/>
+      </w:pPr>
+    </w:lvl>
+    <w:lvl w:ilvl="4" w:tentative="1">
+      <w:start w:val="1"/>
+      <w:numFmt w:val="decimal"/>
+      <w:lvlText w:val="%5."/>
+      <w:lvlJc w:val="left"/>
+      <w:pPr>
+        <w:tabs>
+          <w:tab w:val="num" w:pos="3600"/>
+        </w:tabs>
+        <w:ind w:left="3600" w:hanging="360"/>
+      </w:pPr>
+    </w:lvl>
+    <w:lvl w:ilvl="5" w:tentative="1">
+      <w:start w:val="1"/>
+      <w:numFmt w:val="decimal"/>
+      <w:lvlText w:val="%6."/>
+      <w:lvlJc w:val="left"/>
+      <w:pPr>
+        <w:tabs>
+          <w:tab w:val="num" w:pos="4320"/>
+        </w:tabs>
+        <w:ind w:left="4320" w:hanging="360"/>
+      </w:pPr>
+    </w:lvl>
+    <w:lvl w:ilvl="6" w:tentative="1">
+      <w:start w:val="1"/>
+      <w:numFmt w:val="decimal"/>
+      <w:lvlText w:val="%7."/>
+      <w:lvlJc w:val="left"/>
+      <w:pPr>
+        <w:tabs>
+          <w:tab w:val="num" w:pos="5040"/>
+        </w:tabs>
+        <w:ind w:left="5040" w:hanging="360"/>
+      </w:pPr>
+    </w:lvl>
+    <w:lvl w:ilvl="7" w:tentative="1">
+      <w:start w:val="1"/>
+      <w:numFmt w:val="decimal"/>
+      <w:lvlText w:val="%8."/>
+      <w:lvlJc w:val="left"/>
+      <w:pPr>
+        <w:tabs>
+          <w:tab w:val="num" w:pos="5760"/>
+        </w:tabs>
+        <w:ind w:left="5760" w:hanging="360"/>
+      </w:pPr>
+    </w:lvl>
+    <w:lvl w:ilvl="8" w:tentative="1">
+      <w:start w:val="1"/>
+      <w:numFmt w:val="decimal"/>
+      <w:lvlText w:val="%9."/>
+      <w:lvlJc w:val="left"/>
+      <w:pPr>
+        <w:tabs>
+          <w:tab w:val="num" w:pos="6480"/>
+        </w:tabs>
+        <w:ind w:left="6480" w:hanging="360"/>
+      </w:pPr>
+    </w:lvl>
+  </w:abstractNum>
+  <w:num w:numId="1">
+    <w:abstractNumId w:val="1"/>
+  </w:num>
+  <w:num w:numId="2">
+    <w:abstractNumId w:val="2"/>
+  </w:num>
+  <w:num w:numId="3">
+    <w:abstractNumId w:val="0"/>
+  </w:num>
+</w:numbering>
 </file>
 
 <file path=word/styles.xml><?xml version="1.0" encoding="utf-8"?>
@@ -1608,7 +2598,6 @@
   <w:style w:type="character" w:default="1" w:styleId="a0">
     <w:name w:val="Default Paragraph Font"/>
     <w:uiPriority w:val="1"/>
-    <w:semiHidden/>
     <w:unhideWhenUsed/>
   </w:style>
   <w:style w:type="table" w:default="1" w:styleId="a1">
@@ -1930,6 +2919,25 @@
     <w:pPr>
       <w:spacing w:after="0" w:line="240" w:lineRule="auto"/>
     </w:pPr>
+  </w:style>
+  <w:style w:type="table" w:styleId="ad">
+    <w:name w:val="Table Grid"/>
+    <w:basedOn w:val="a1"/>
+    <w:uiPriority w:val="39"/>
+    <w:rsid w:val="00C40BEF"/>
+    <w:pPr>
+      <w:spacing w:after="0" w:line="240" w:lineRule="auto"/>
+    </w:pPr>
+    <w:tblPr>
+      <w:tblBorders>
+        <w:top w:val="single" w:sz="4" w:space="0" w:color="auto"/>
+        <w:left w:val="single" w:sz="4" w:space="0" w:color="auto"/>
+        <w:bottom w:val="single" w:sz="4" w:space="0" w:color="auto"/>
+        <w:right w:val="single" w:sz="4" w:space="0" w:color="auto"/>
+        <w:insideH w:val="single" w:sz="4" w:space="0" w:color="auto"/>
+        <w:insideV w:val="single" w:sz="4" w:space="0" w:color="auto"/>
+      </w:tblBorders>
+    </w:tblPr>
   </w:style>
 </w:styles>
 </file>

</xml_diff>